<commit_message>
Refactor Customer Insight page layout and metrics; add SVG icons for improved UI; update danger color in data loader
</commit_message>
<xml_diff>
--- a/INTERPRETASI REVISI.docx
+++ b/INTERPRETASI REVISI.docx
@@ -3325,13 +3325,7 @@
       </w:r>
       <w:proofErr w:type="spellEnd"/>
       <w:r>
-        <w:t>.</w:t>
-      </w:r>
-      <w:r>
-        <w:t xml:space="preserve"> </w:t>
-      </w:r>
-      <w:r>
-        <w:t xml:space="preserve">Business Development Manager </w:t>
+        <w:t xml:space="preserve">. Business Development Manager </w:t>
       </w:r>
       <w:proofErr w:type="spellStart"/>
       <w:r>
@@ -3696,8 +3690,33 @@
           <w:b/>
           <w:bCs/>
         </w:rPr>
-        <w:t xml:space="preserve"> yang sedang dibuka</w:t>
-      </w:r>
+        <w:t xml:space="preserve"> yang </w:t>
+      </w:r>
+      <w:proofErr w:type="spellStart"/>
+      <w:r>
+        <w:rPr>
+          <w:b/>
+          <w:bCs/>
+        </w:rPr>
+        <w:t>sedang</w:t>
+      </w:r>
+      <w:proofErr w:type="spellEnd"/>
+      <w:r>
+        <w:rPr>
+          <w:b/>
+          <w:bCs/>
+        </w:rPr>
+        <w:t xml:space="preserve"> </w:t>
+      </w:r>
+      <w:proofErr w:type="spellStart"/>
+      <w:r>
+        <w:rPr>
+          <w:b/>
+          <w:bCs/>
+        </w:rPr>
+        <w:t>dibuka</w:t>
+      </w:r>
+      <w:proofErr w:type="spellEnd"/>
     </w:p>
     <w:p>
       <w:pPr>
@@ -3832,7 +3851,23 @@
         <w:jc w:val="both"/>
       </w:pPr>
       <w:r>
-        <w:t xml:space="preserve">Executive Summary: ringkasan kondisi bisnis, KPI </w:t>
+        <w:t xml:space="preserve">Executive Summary: ringkasan </w:t>
+      </w:r>
+      <w:proofErr w:type="spellStart"/>
+      <w:r>
+        <w:t>kondisi</w:t>
+      </w:r>
+      <w:proofErr w:type="spellEnd"/>
+      <w:r>
+        <w:t xml:space="preserve"> </w:t>
+      </w:r>
+      <w:proofErr w:type="spellStart"/>
+      <w:r>
+        <w:t>bisnis</w:t>
+      </w:r>
+      <w:proofErr w:type="spellEnd"/>
+      <w:r>
+        <w:t xml:space="preserve">, KPI </w:t>
       </w:r>
       <w:proofErr w:type="spellStart"/>
       <w:r>
@@ -3966,6 +4001,13 @@
         </w:rPr>
         <w:t xml:space="preserve"> Action Recommendation</w:t>
       </w:r>
+      <w:r>
+        <w:rPr>
+          <w:b/>
+          <w:bCs/>
+        </w:rPr>
+        <w:t xml:space="preserve"> (BELUM)</w:t>
+      </w:r>
     </w:p>
     <w:p>
       <w:pPr>
@@ -3980,7 +4022,15 @@
       </w:r>
       <w:proofErr w:type="spellEnd"/>
       <w:r>
-        <w:t xml:space="preserve"> AI memberikan insight, ditambahkan bagian Action Recommendation, misalnya Priority 1 memprioritaskan ekspansi ke Makassar, Priority 2 mengevaluasi biaya operasional weekend, Priority 3 mempertahankan branch type Mall, dan Priority 4 meningkatkan Average Ticket.</w:t>
+        <w:t xml:space="preserve"> AI </w:t>
+      </w:r>
+      <w:proofErr w:type="spellStart"/>
+      <w:r>
+        <w:t>memberikan</w:t>
+      </w:r>
+      <w:proofErr w:type="spellEnd"/>
+      <w:r>
+        <w:t xml:space="preserve"> insight, ditambahkan bagian Action Recommendation, misalnya Priority 1 memprioritaskan ekspansi ke Makassar, Priority 2 mengevaluasi biaya operasional weekend, Priority 3 mempertahankan branch type Mall, dan Priority 4 meningkatkan Average Ticket.</w:t>
       </w:r>
     </w:p>
     <w:p>
@@ -3999,7 +4049,31 @@
       </w:r>
       <w:proofErr w:type="spellEnd"/>
       <w:r>
-        <w:t xml:space="preserve"> membutuhkan rekomendasi tindakan dibanding hanya mengetahui kondisi bisnis.</w:t>
+        <w:t xml:space="preserve"> </w:t>
+      </w:r>
+      <w:proofErr w:type="spellStart"/>
+      <w:r>
+        <w:t>membutuhkan</w:t>
+      </w:r>
+      <w:proofErr w:type="spellEnd"/>
+      <w:r>
+        <w:t xml:space="preserve"> </w:t>
+      </w:r>
+      <w:proofErr w:type="spellStart"/>
+      <w:r>
+        <w:t>rekomendasi</w:t>
+      </w:r>
+      <w:proofErr w:type="spellEnd"/>
+      <w:r>
+        <w:t xml:space="preserve"> </w:t>
+      </w:r>
+      <w:proofErr w:type="spellStart"/>
+      <w:r>
+        <w:t>tindakan</w:t>
+      </w:r>
+      <w:proofErr w:type="spellEnd"/>
+      <w:r>
+        <w:t xml:space="preserve"> dibanding hanya mengetahui kondisi bisnis.</w:t>
       </w:r>
     </w:p>
     <w:p>
@@ -4031,6 +4105,13 @@
           <w:bCs/>
         </w:rPr>
         <w:t xml:space="preserve"> Explain This Chart</w:t>
+      </w:r>
+      <w:r>
+        <w:rPr>
+          <w:b/>
+          <w:bCs/>
+        </w:rPr>
+        <w:t xml:space="preserve"> (BELUM)</w:t>
       </w:r>
     </w:p>
     <w:p>
@@ -4136,6 +4217,93 @@
         </w:rPr>
         <w:t xml:space="preserve"> Quick Prompt</w:t>
       </w:r>
+      <w:r>
+        <w:rPr>
+          <w:b/>
+          <w:bCs/>
+        </w:rPr>
+        <w:t xml:space="preserve"> (</w:t>
+      </w:r>
+      <w:proofErr w:type="spellStart"/>
+      <w:r>
+        <w:rPr>
+          <w:b/>
+          <w:bCs/>
+        </w:rPr>
+        <w:t>ada</w:t>
+      </w:r>
+      <w:proofErr w:type="spellEnd"/>
+      <w:r>
+        <w:rPr>
+          <w:b/>
+          <w:bCs/>
+        </w:rPr>
+        <w:t xml:space="preserve"> </w:t>
+      </w:r>
+      <w:proofErr w:type="spellStart"/>
+      <w:r>
+        <w:rPr>
+          <w:b/>
+          <w:bCs/>
+        </w:rPr>
+        <w:t>tp</w:t>
+      </w:r>
+      <w:proofErr w:type="spellEnd"/>
+      <w:r>
+        <w:rPr>
+          <w:b/>
+          <w:bCs/>
+        </w:rPr>
+        <w:t xml:space="preserve"> </w:t>
+      </w:r>
+      <w:proofErr w:type="spellStart"/>
+      <w:r>
+        <w:rPr>
+          <w:b/>
+          <w:bCs/>
+        </w:rPr>
+        <w:t>blm</w:t>
+      </w:r>
+      <w:proofErr w:type="spellEnd"/>
+      <w:r>
+        <w:rPr>
+          <w:b/>
+          <w:bCs/>
+        </w:rPr>
+        <w:t xml:space="preserve"> </w:t>
+      </w:r>
+      <w:proofErr w:type="spellStart"/>
+      <w:r>
+        <w:rPr>
+          <w:b/>
+          <w:bCs/>
+        </w:rPr>
+        <w:t>bisa</w:t>
+      </w:r>
+      <w:proofErr w:type="spellEnd"/>
+      <w:r>
+        <w:rPr>
+          <w:b/>
+          <w:bCs/>
+        </w:rPr>
+        <w:t xml:space="preserve"> </w:t>
+      </w:r>
+      <w:proofErr w:type="spellStart"/>
+      <w:r>
+        <w:rPr>
+          <w:b/>
+          <w:bCs/>
+        </w:rPr>
+        <w:t>dipencet</w:t>
+      </w:r>
+      <w:proofErr w:type="spellEnd"/>
+      <w:r>
+        <w:rPr>
+          <w:b/>
+          <w:bCs/>
+        </w:rPr>
+        <w:t>)</w:t>
+      </w:r>
     </w:p>
     <w:p>
       <w:pPr>
@@ -4418,7 +4586,15 @@
       </w:r>
       <w:proofErr w:type="spellEnd"/>
       <w:r>
-        <w:t xml:space="preserve"> langsung di source code, melainkan diakses melalui st.secrets[“GROQ_API_KEY“]. File .streamlit/secrets.toml tidak diunggah ke GitHub dan API Key dimasukkan melalui menu Secrets pada Streamlit Community Cloud saat deployment.</w:t>
+        <w:t xml:space="preserve"> </w:t>
+      </w:r>
+      <w:proofErr w:type="spellStart"/>
+      <w:r>
+        <w:t>langsung</w:t>
+      </w:r>
+      <w:proofErr w:type="spellEnd"/>
+      <w:r>
+        <w:t xml:space="preserve"> di source code, melainkan diakses melalui st.secrets[“GROQ_API_KEY“]. File .streamlit/secrets.toml tidak diunggah ke GitHub dan API Key dimasukkan melalui menu Secrets pada Streamlit Community Cloud saat deployment.</w:t>
       </w:r>
     </w:p>
     <w:p>
@@ -4445,7 +4621,23 @@
       </w:r>
       <w:proofErr w:type="spellEnd"/>
       <w:r>
-        <w:t>, menghindari kebocoran credential, dan sesuai best practice deployment aplikasi Streamlit.</w:t>
+        <w:t xml:space="preserve">, </w:t>
+      </w:r>
+      <w:proofErr w:type="spellStart"/>
+      <w:r>
+        <w:t>menghindari</w:t>
+      </w:r>
+      <w:proofErr w:type="spellEnd"/>
+      <w:r>
+        <w:t xml:space="preserve"> </w:t>
+      </w:r>
+      <w:proofErr w:type="spellStart"/>
+      <w:r>
+        <w:t>kebocoran</w:t>
+      </w:r>
+      <w:proofErr w:type="spellEnd"/>
+      <w:r>
+        <w:t xml:space="preserve"> credential, dan sesuai best practice deployment aplikasi Streamlit.</w:t>
       </w:r>
     </w:p>
     <w:p>

</xml_diff>